<commit_message>
Reescreve a fala dos cinco vendedores para ser dizível
A versão anterior terminava em "a minha pergunta é de quem", que é construção
escrita: quem ouve precisa reconstruir "organização de quem" no ar e perde o
fio. E empilhava quatro nomes com dois qualificadores numa respiração só.

Agora são cinco frases curtas, uma ideia cada. Os dois especialistas ganham
um tempo próprio, porque é neles que está o achado, e "linha de aquário e
linha de ave" substitui "linhas de nicho", que é vocabulário de consultoria
e não de fábrica.

A pergunta fica sozinha no fim, sem nada grudado nela, que é o que faz o
silêncio seguinte funcionar.

Co-Authored-By: Claude Opus 5 <noreply@anthropic.com>
Claude-Session: https://claude.ai/code/session_017xRPoJqxsuGFv4VmDesebx
</commit_message>
<xml_diff>
--- a/stillpet/Roteiro-de-fala-StillPet.docx
+++ b/stillpet/Roteiro-de-fala-StillPet.docx
@@ -436,7 +436,79 @@
           <w:sz w:val="23"/>
           <w:szCs w:val="23"/>
         </w:rPr>
-        <w:t xml:space="preserve">Hoje tem cinco vendedores anunciando esse catálogo na Amazon. Um é a própria Amazon, que compra de vocês. Os outros quatro são a Cobasi, o Empório Animal, uma loja chamada Only Fish, que é especialista em aquarismo, e outra chamada Paraíso dos Pássaros, especialista em aves. Repara que os dois últimos pegaram justamente as duas linhas de nicho da fábrica de vocês. Isso não é bagunça, é organização. A minha pergunta é de quem.</w:t>
+        <w:t xml:space="preserve">Hoje tem cinco vendedores anunciando esse catálogo na Amazon.</w:t>
+      </w:r>
+    </w:p>
+    <w:p>
+      <w:pPr>
+        <w:pBdr>
+          <w:left w:val="single" w:color="B23410" w:sz="14" w:space="12"/>
+        </w:pBdr>
+        <w:spacing w:after="130" w:line="300"/>
+        <w:ind w:left="403"/>
+      </w:pPr>
+      <w:r>
+        <w:rPr>
+          <w:rFonts w:ascii="Georgia" w:cs="Georgia" w:eastAsia="Georgia" w:hAnsi="Georgia"/>
+          <w:color w:val="1A1512"/>
+          <w:sz w:val="23"/>
+          <w:szCs w:val="23"/>
+        </w:rPr>
+        <w:t xml:space="preserve">Um é a própria Amazon, que compra de vocês. Os outros quatro são a Cobasi, o Empório Animal, e duas lojas menores: a Only Fish e a Paraíso dos Pássaros.</w:t>
+      </w:r>
+    </w:p>
+    <w:p>
+      <w:pPr>
+        <w:pBdr>
+          <w:left w:val="single" w:color="B23410" w:sz="14" w:space="12"/>
+        </w:pBdr>
+        <w:spacing w:after="130" w:line="300"/>
+        <w:ind w:left="403"/>
+      </w:pPr>
+      <w:r>
+        <w:rPr>
+          <w:rFonts w:ascii="Georgia" w:cs="Georgia" w:eastAsia="Georgia" w:hAnsi="Georgia"/>
+          <w:color w:val="1A1512"/>
+          <w:sz w:val="23"/>
+          <w:szCs w:val="23"/>
+        </w:rPr>
+        <w:t xml:space="preserve">Repara no nome das duas últimas. Only Fish é de aquarismo. Paraíso dos Pássaros é de passarinho. Elas pegaram exatamente a linha de aquário e a linha de ave de vocês.</w:t>
+      </w:r>
+    </w:p>
+    <w:p>
+      <w:pPr>
+        <w:pBdr>
+          <w:left w:val="single" w:color="B23410" w:sz="14" w:space="12"/>
+        </w:pBdr>
+        <w:spacing w:after="130" w:line="300"/>
+        <w:ind w:left="403"/>
+      </w:pPr>
+      <w:r>
+        <w:rPr>
+          <w:rFonts w:ascii="Georgia" w:cs="Georgia" w:eastAsia="Georgia" w:hAnsi="Georgia"/>
+          <w:color w:val="1A1512"/>
+          <w:sz w:val="23"/>
+          <w:szCs w:val="23"/>
+        </w:rPr>
+        <w:t xml:space="preserve">Isso não é bagunça. Isso é organizado. Só que quem organizou não foram vocês.</w:t>
+      </w:r>
+    </w:p>
+    <w:p>
+      <w:pPr>
+        <w:pBdr>
+          <w:left w:val="single" w:color="B23410" w:sz="14" w:space="12"/>
+        </w:pBdr>
+        <w:spacing w:after="130" w:line="300"/>
+        <w:ind w:left="403"/>
+      </w:pPr>
+      <w:r>
+        <w:rPr>
+          <w:rFonts w:ascii="Georgia" w:cs="Georgia" w:eastAsia="Georgia" w:hAnsi="Georgia"/>
+          <w:color w:val="1A1512"/>
+          <w:sz w:val="23"/>
+          <w:szCs w:val="23"/>
+        </w:rPr>
+        <w:t xml:space="preserve">Esses quatro — vocês escolheram?</w:t>
       </w:r>
     </w:p>
     <w:p>
@@ -652,7 +724,7 @@
           <w:sz w:val="19"/>
           <w:szCs w:val="19"/>
         </w:rPr>
-        <w:t xml:space="preserve">“A pergunta é de quem” é a frase que faz o trabalho. Você não acusou ninguém de nada e mesmo assim colocou a questão do controle na mesa. E note que você elogiou os revendedores antes: chamar a organização deles de organização tira qualquer tom de reclamação.</w:t>
+        <w:t xml:space="preserve">A fala está quebrada em cinco pedaços curtos de propósito: lista de quatro nomes numa respiração só ninguém acompanha. Cada frase é uma ideia, e a última é só a pergunta, sem nada grudado nela — é o que faz o silêncio depois funcionar. E note que você elogia os revendedores antes de perguntar: chamar a organização deles de organização tira qualquer tom de reclamação, e mesmo assim coloca o controle na mesa.</w:t>
       </w:r>
     </w:p>
     <w:p>

</xml_diff>